<commit_message>
docs: rebuild HAKOBI introduction around first use and team workflow
</commit_message>
<xml_diff>
--- a/docs/hakobi-showcase/HAKOBI_紹介資料.docx
+++ b/docs/hakobi-showcase/HAKOBI_紹介資料.docx
@@ -11,20 +11,9 @@
           <w:rFonts w:ascii="Yu Gothic" w:hAnsi="Yu Gothic" w:eastAsia="Yu Gothic" w:cs="Yu Gothic"/>
           <w:b/>
           <w:color w:val="000000"/>
-          <w:sz w:val="60"/>
+          <w:sz w:val="34"/>
         </w:rPr>
-        <w:t>HAKOBI</w:t>
-      </w:r>
-    </w:p>
-    <w:p>
-      <w:r>
-        <w:rPr>
-          <w:rFonts w:ascii="Yu Gothic" w:hAnsi="Yu Gothic" w:eastAsia="Yu Gothic" w:cs="Yu Gothic"/>
-          <w:b w:val="0"/>
-          <w:color w:val="526271"/>
-          <w:sz w:val="22"/>
-        </w:rPr>
-        <w:t>チームで進捗と相談を共有する</w:t>
+        <w:t>HAKOBIで予定と進捗を共有する</w:t>
       </w:r>
     </w:p>
     <w:p>
@@ -38,7 +27,7 @@
           <w:color w:val="000000"/>
           <w:sz w:val="40"/>
         </w:rPr>
-        <w:t>チームの進み具合がわかる</w:t>
+        <w:t>どこまで進んだかを同じ画面で確かめる</w:t>
       </w:r>
     </w:p>
     <w:p>
@@ -49,7 +38,7 @@
           <w:color w:val="233544"/>
           <w:sz w:val="22"/>
         </w:rPr>
-        <w:t>「あの仕事、どこまで進んでいる？」「困っていることはない？」HAKOBI（ハコビ）は、仕事の担当・期限・進捗をチームで共有できるタスク管理ツールです。その仕事についての相談と返信も、一緒に残せます。誰が何を進めていて、どこで困っているのかを確かめられます。</w:t>
+        <w:t>「あの仕事、どこまで進んだ？」「誰に相談すればいい？」。HAKOBI（ハコビ）は、仕事の日程・進捗・相談をまとめて扱えるタスク管理ツールです。自分のPCでひとりで始め、チームでは担当と期限を共有して使えます。</w:t>
       </w:r>
     </w:p>
     <w:p>
@@ -62,7 +51,7 @@
         <w:drawing>
           <wp:inline xmlns:a="http://schemas.openxmlformats.org/drawingml/2006/main" xmlns:pic="http://schemas.openxmlformats.org/drawingml/2006/picture">
             <wp:extent cx="6264000" cy="1609500"/>
-            <wp:docPr id="1" name="Picture 1" descr="仕事ごとの日程・担当・進捗を並べたガント画面。横棒の長さが予定の期間を表します。"/>
+            <wp:docPr id="1" name="Picture 1" descr="チームのガント画面。見る所は仕事の横棒、担当名、進捗率。何が重なり、誰がどこまで進めているかを確かめられます。"/>
             <wp:cNvGraphicFramePr>
               <a:graphicFrameLocks noChangeAspect="1"/>
             </wp:cNvGraphicFramePr>
@@ -104,7 +93,7 @@
           <w:color w:val="526271"/>
           <w:sz w:val="17"/>
         </w:rPr>
-        <w:t>仕事ごとの日程・担当・進捗を並べたガント画面。横棒の長さが予定の期間を表します。</w:t>
+        <w:t>チームのガント画面。見る所は仕事の横棒、担当名、進捗率。何が重なり、誰がどこまで進めているかを確かめられます。</w:t>
       </w:r>
     </w:p>
     <w:p>
@@ -118,7 +107,7 @@
           <w:color w:val="000000"/>
           <w:sz w:val="25"/>
         </w:rPr>
-        <w:t>朝の確認から週報まで</w:t>
+        <w:t>この資料で紹介する使い方</w:t>
       </w:r>
     </w:p>
     <w:p>
@@ -129,7 +118,7 @@
           <w:color w:val="233544"/>
           <w:sz w:val="22"/>
         </w:rPr>
-        <w:t>朝は期限の近い仕事や進み具合を確認し、作業中に困ったら、その仕事の記録から相談できます。定例で次の対応を決めるときも、週報を書くときも、日々の記録を使えます。</w:t>
+        <w:t>自分の仕事を登録して日程を確かめる。チームで困ったことを相談し、定例で決まった対応を次の仕事へ。週報も日々の記録から材料を取り出せます。</w:t>
       </w:r>
     </w:p>
     <w:p>
@@ -140,7 +129,7 @@
           <w:color w:val="233544"/>
           <w:sz w:val="22"/>
         </w:rPr>
-        <w:t>確認のたびに状況を聞き直す手間や、報告のために書き直す手間を減らしたいチームに向けた使い方を紹介します。</w:t>
+        <w:t>月次集計の見直し、説明会の準備、関係先からの回答待ちなど、日程のある仕事から試せます。個人用はチームサーバー不要。チーム利用には社内LANのサーバーと、管理者が発行するアカウントが必要です。</w:t>
       </w:r>
     </w:p>
     <w:p>
@@ -154,7 +143,7 @@
           <w:color w:val="000000"/>
           <w:sz w:val="25"/>
         </w:rPr>
-        <w:t>こんな仕事から使えます</w:t>
+        <w:t>いまの状況から始める</w:t>
       </w:r>
     </w:p>
     <w:p>
@@ -165,7 +154,7 @@
           <w:color w:val="233544"/>
           <w:sz w:val="22"/>
         </w:rPr>
-        <w:t>月次集計の見直し、説明会の準備、関係先からの回答待ち。日程と担当がある普段の仕事から始められます。毎日・毎月・毎年のように繰り返す仕事も登録できます。</w:t>
+        <w:t>ひとりで試す人は次のページへ。チームで使う場面は3〜5ページ、入手や準備の案内と試用の確認は6ページにあります。</w:t>
       </w:r>
     </w:p>
     <w:p>
@@ -176,7 +165,26 @@
           <w:color w:val="233544"/>
           <w:sz w:val="22"/>
         </w:rPr>
-        <w:t>この資料では「月次集計の見直し」を例に、確認・相談・定例・週報の流れを追います。画面の人名・仕事・やり取りは架空です。2026年10月21日のアプリで撮影しました。</w:t>
+        <w:t>詳しい機能と操作は、同封の</w:t>
+      </w:r>
+      <w:hyperlink r:id="rId12">
+        <w:r>
+          <w:rPr>
+            <w:color w:val="0B6666"/>
+            <w:sz w:val="22"/>
+            <w:u w:val="single"/>
+          </w:rPr>
+          <w:t>はじめ方ガイド</w:t>
+        </w:r>
+      </w:hyperlink>
+      <w:r>
+        <w:rPr>
+          <w:rFonts w:ascii="Yu Gothic" w:hAnsi="Yu Gothic" w:eastAsia="Yu Gothic" w:cs="Yu Gothic"/>
+          <w:b w:val="0"/>
+          <w:color w:val="233544"/>
+          <w:sz w:val="22"/>
+        </w:rPr>
+        <w:t>へ。画面の人名・仕事・やり取りは架空です。チーム画面は2026年10月21日、個人用画面は10月22日の実アプリで撮影しました。導入効果を測定した報告ではありません。</w:t>
       </w:r>
     </w:p>
     <w:p>
@@ -195,7 +203,7 @@
           <w:color w:val="000000"/>
           <w:sz w:val="40"/>
         </w:rPr>
-        <w:t>誰が何を進めているかが見える</w:t>
+        <w:t>まず自分の仕事をひとつ登録する</w:t>
       </w:r>
     </w:p>
     <w:p>
@@ -206,7 +214,7 @@
           <w:color w:val="233544"/>
           <w:sz w:val="22"/>
         </w:rPr>
-        <w:t>朝、チームの予定を見渡すなら「ガント」を開きます。ガントは、仕事の日程を横棒で並べた画面です。横棒で予定の期間を見ながら、担当者と現在の進捗率を確かめられます。</w:t>
+        <w:t>個人用では、仕事と記録を自分のPC内に保存します。チームのアカウントを作らずに試せます。Windows用インストーラーを配布担当者から受け取って起動し、接続画面の下にある「このPCで個人用として使う」を押します。</w:t>
       </w:r>
     </w:p>
     <w:p>
@@ -218,8 +226,8 @@
       <w:r>
         <w:drawing>
           <wp:inline xmlns:a="http://schemas.openxmlformats.org/drawingml/2006/main" xmlns:pic="http://schemas.openxmlformats.org/drawingml/2006/picture">
-            <wp:extent cx="6264000" cy="424079"/>
-            <wp:docPr id="2" name="Picture 2" descr="月次集計の見直しは佐藤が担当して進捗50%。入力フォームの試作と関係部署への確認を、同じ日程の中で見られます。"/>
+            <wp:extent cx="5040000" cy="1326316"/>
+            <wp:docPr id="2" name="Picture 2" descr="初回の接続画面の下部を切り出した例。「このチームに接続する」の下にある「このPCで個人用として使う」が個人用の入口です。"/>
             <wp:cNvGraphicFramePr>
               <a:graphicFrameLocks noChangeAspect="1"/>
             </wp:cNvGraphicFramePr>
@@ -227,11 +235,11 @@
               <a:graphicData uri="http://schemas.openxmlformats.org/drawingml/2006/picture">
                 <pic:pic>
                   <pic:nvPicPr>
-                    <pic:cNvPr id="0" name="gantt-task.png"/>
+                    <pic:cNvPr id="0" name="personal-launcher-focus.png"/>
                     <pic:cNvPicPr/>
                   </pic:nvPicPr>
                   <pic:blipFill>
-                    <a:blip r:embed="rId12"/>
+                    <a:blip r:embed="rId13"/>
                     <a:stretch>
                       <a:fillRect/>
                     </a:stretch>
@@ -239,7 +247,7 @@
                   <pic:spPr>
                     <a:xfrm>
                       <a:off x="0" y="0"/>
-                      <a:ext cx="6264000" cy="424079"/>
+                      <a:ext cx="5040000" cy="1326316"/>
                     </a:xfrm>
                     <a:prstGeom prst="rect"/>
                   </pic:spPr>
@@ -261,7 +269,7 @@
           <w:color w:val="526271"/>
           <w:sz w:val="17"/>
         </w:rPr>
-        <w:t>月次集計の見直しは佐藤が担当して進捗50%。入力フォームの試作と関係部署への確認を、同じ日程の中で見られます。</w:t>
+        <w:t>初回の接続画面の下部を切り出した例。「このチームに接続する」の下にある「このPCで個人用として使う」が個人用の入口です。</w:t>
       </w:r>
     </w:p>
     <w:p>
@@ -275,7 +283,7 @@
           <w:color w:val="000000"/>
           <w:sz w:val="25"/>
         </w:rPr>
-        <w:t>次に確認したい仕事が見つかる</w:t>
+        <w:t>登録した仕事が予定になる</w:t>
       </w:r>
     </w:p>
     <w:p>
@@ -286,7 +294,152 @@
           <w:color w:val="233544"/>
           <w:sz w:val="22"/>
         </w:rPr>
-        <w:t>「月次集計の見直し」は佐藤さんが担当し、進捗は50%。中の作業を開くと、「入力フォームを試作する」と「関係部署と内容を確かめる」が見えます。仕事の名前と担当が分かるので、誰に何を確認するかを考える材料になります。</w:t>
+        <w:t>「タスクを追加」で仕事の名前・開始日・期限を入れます。「ガント」は日程を横棒で並べる画面です。例では「月次集計の見直し」を登録し、進捗を25%にしています。</w:t>
+      </w:r>
+    </w:p>
+    <w:p>
+      <w:pPr>
+        <w:keepNext/>
+        <w:spacing w:line="240" w:lineRule="auto"/>
+        <w:jc w:val="center"/>
+      </w:pPr>
+      <w:r>
+        <w:drawing>
+          <wp:inline xmlns:a="http://schemas.openxmlformats.org/drawingml/2006/main" xmlns:pic="http://schemas.openxmlformats.org/drawingml/2006/picture">
+            <wp:extent cx="6264000" cy="826500"/>
+            <wp:docPr id="3" name="Picture 3" descr="個人用で登録した月次集計の見直し。見る所は10月22日から30日までの予定と進捗25%。担当者を割り当てるチーム画面とは別の、個人用の実画面です。"/>
+            <wp:cNvGraphicFramePr>
+              <a:graphicFrameLocks noChangeAspect="1"/>
+            </wp:cNvGraphicFramePr>
+            <a:graphic>
+              <a:graphicData uri="http://schemas.openxmlformats.org/drawingml/2006/picture">
+                <pic:pic>
+                  <pic:nvPicPr>
+                    <pic:cNvPr id="0" name="personal-gantt-focus.png"/>
+                    <pic:cNvPicPr/>
+                  </pic:nvPicPr>
+                  <pic:blipFill>
+                    <a:blip r:embed="rId14"/>
+                    <a:stretch>
+                      <a:fillRect/>
+                    </a:stretch>
+                  </pic:blipFill>
+                  <pic:spPr>
+                    <a:xfrm>
+                      <a:off x="0" y="0"/>
+                      <a:ext cx="6264000" cy="826500"/>
+                    </a:xfrm>
+                    <a:prstGeom prst="rect"/>
+                  </pic:spPr>
+                </pic:pic>
+              </a:graphicData>
+            </a:graphic>
+          </wp:inline>
+        </w:drawing>
+      </w:r>
+    </w:p>
+    <w:p>
+      <w:pPr>
+        <w:spacing w:after="160" w:line="240" w:lineRule="exact"/>
+      </w:pPr>
+      <w:r>
+        <w:rPr>
+          <w:rFonts w:ascii="Yu Gothic" w:hAnsi="Yu Gothic" w:eastAsia="Yu Gothic" w:cs="Yu Gothic"/>
+          <w:b w:val="0"/>
+          <w:color w:val="526271"/>
+          <w:sz w:val="17"/>
+        </w:rPr>
+        <w:t>個人用で登録した月次集計の見直し。見る所は10月22日から30日までの予定と進捗25%。担当者を割り当てるチーム画面とは別の、個人用の実画面です。</w:t>
+      </w:r>
+    </w:p>
+    <w:p>
+      <w:r>
+        <w:rPr>
+          <w:rFonts w:ascii="Yu Gothic" w:hAnsi="Yu Gothic" w:eastAsia="Yu Gothic" w:cs="Yu Gothic"/>
+          <w:b w:val="0"/>
+          <w:color w:val="233544"/>
+          <w:sz w:val="22"/>
+        </w:rPr>
+        <w:t>作業の区切りにタスク詳細の「進捗ログを書く」から、できたことと次にやることを残します。日付付きで積み上がるので、後から経過を見返せます。時間帯を決める「計画」、作業時間のタイマー、状態で分けるカンバンも使えます。</w:t>
+      </w:r>
+    </w:p>
+    <w:p>
+      <w:r>
+        <w:rPr>
+          <w:rFonts w:ascii="Yu Gothic" w:hAnsi="Yu Gothic" w:eastAsia="Yu Gothic" w:cs="Yu Gothic"/>
+          <w:b w:val="0"/>
+          <w:color w:val="233544"/>
+          <w:sz w:val="22"/>
+        </w:rPr>
+        <w:t>入手先がまだなければ、6ページの準備担当者向け案内へ。個人用の起動と登録は</w:t>
+      </w:r>
+      <w:hyperlink r:id="rId15">
+        <w:r>
+          <w:rPr>
+            <w:color w:val="0B6666"/>
+            <w:sz w:val="22"/>
+            <w:u w:val="single"/>
+          </w:rPr>
+          <w:t>ガイド01</w:t>
+        </w:r>
+      </w:hyperlink>
+      <w:r>
+        <w:rPr>
+          <w:rFonts w:ascii="Yu Gothic" w:hAnsi="Yu Gothic" w:eastAsia="Yu Gothic" w:cs="Yu Gothic"/>
+          <w:b w:val="0"/>
+          <w:color w:val="233544"/>
+          <w:sz w:val="22"/>
+        </w:rPr>
+        <w:t>、その他の機能は</w:t>
+      </w:r>
+      <w:hyperlink r:id="rId16">
+        <w:r>
+          <w:rPr>
+            <w:color w:val="0B6666"/>
+            <w:sz w:val="22"/>
+            <w:u w:val="single"/>
+          </w:rPr>
+          <w:t>画面で見る機能紹介</w:t>
+        </w:r>
+      </w:hyperlink>
+      <w:r>
+        <w:rPr>
+          <w:rFonts w:ascii="Yu Gothic" w:hAnsi="Yu Gothic" w:eastAsia="Yu Gothic" w:cs="Yu Gothic"/>
+          <w:b w:val="0"/>
+          <w:color w:val="233544"/>
+          <w:sz w:val="22"/>
+        </w:rPr>
+        <w:t>で確認できます。</w:t>
+      </w:r>
+    </w:p>
+    <w:p>
+      <w:r>
+        <w:br w:type="page"/>
+      </w:r>
+    </w:p>
+    <w:p>
+      <w:pPr>
+        <w:pStyle w:val="Heading1"/>
+      </w:pPr>
+      <w:r>
+        <w:rPr>
+          <w:rFonts w:ascii="Yu Gothic" w:hAnsi="Yu Gothic" w:eastAsia="Yu Gothic" w:cs="Yu Gothic"/>
+          <w:b/>
+          <w:color w:val="000000"/>
+          <w:sz w:val="40"/>
+        </w:rPr>
+        <w:t>担当と期限をチームで見渡す</w:t>
+      </w:r>
+    </w:p>
+    <w:p>
+      <w:r>
+        <w:rPr>
+          <w:rFonts w:ascii="Yu Gothic" w:hAnsi="Yu Gothic" w:eastAsia="Yu Gothic" w:cs="Yu Gothic"/>
+          <w:b w:val="0"/>
+          <w:color w:val="233544"/>
+          <w:sz w:val="22"/>
+        </w:rPr>
+        <w:t>チームで使うと、同じ仕事の担当・期限・進捗をメンバー同士で共有できます。ガントで仕事ごとの予定を見渡し、「チーム」でメンバーごとの状況を確かめます。</w:t>
       </w:r>
     </w:p>
     <w:p>
@@ -299,7 +452,7 @@
         <w:drawing>
           <wp:inline xmlns:a="http://schemas.openxmlformats.org/drawingml/2006/main" xmlns:pic="http://schemas.openxmlformats.org/drawingml/2006/picture">
             <wp:extent cx="6264000" cy="2069543"/>
-            <wp:docPr id="3" name="Picture 3" descr="チーム画面では、メンバーごとの未完了・保留中・期限超過などの件数を確認できます。"/>
+            <wp:docPr id="4" name="Picture 4" descr="メンバーごとの担当状況。見る所は未完了・保留中・期限超過・報告なしの件数。気になる件数から仕事を開き、進捗ログで事情を確かめて相談につなげます。"/>
             <wp:cNvGraphicFramePr>
               <a:graphicFrameLocks noChangeAspect="1"/>
             </wp:cNvGraphicFramePr>
@@ -311,7 +464,7 @@
                     <pic:cNvPicPr/>
                   </pic:nvPicPr>
                   <pic:blipFill>
-                    <a:blip r:embed="rId13"/>
+                    <a:blip r:embed="rId17"/>
                     <a:stretch>
                       <a:fillRect/>
                     </a:stretch>
@@ -341,7 +494,7 @@
           <w:color w:val="526271"/>
           <w:sz w:val="17"/>
         </w:rPr>
-        <w:t>チーム画面では、メンバーごとの未完了・保留中・期限超過などの件数を確認できます。</w:t>
+        <w:t>メンバーごとの担当状況。見る所は未完了・保留中・期限超過・報告なしの件数。気になる件数から仕事を開き、進捗ログで事情を確かめて相談につなげます。</w:t>
       </w:r>
     </w:p>
     <w:p>
@@ -355,7 +508,7 @@
           <w:color w:val="000000"/>
           <w:sz w:val="25"/>
         </w:rPr>
-        <w:t>リーダーも同じ情報を見られる</w:t>
+        <w:t>ひとりで残した仕事を引き継ぐ</w:t>
       </w:r>
     </w:p>
     <w:p>
@@ -366,7 +519,92 @@
           <w:color w:val="233544"/>
           <w:sz w:val="22"/>
         </w:rPr>
-        <w:t>「チーム」ではメンバーごとの担当状況や、期限の近い仕事を確認できます。「報告なし」などの件数から、気になる仕事を開くこともできます。件数だけで判断せず、その仕事の日付付きの記録「進捗ログ」を読んで状況を確かめ、相談につなげます。</w:t>
+        <w:t>個人用とチーム用は保存先が別です。チームへ接続するだけで、個人用の仕事が移るわけではありません。引き継ぐときは、バックアップを残し、管理者が個人用DBをチームへ取り込みます。</w:t>
+      </w:r>
+    </w:p>
+    <w:p>
+      <w:r>
+        <w:rPr>
+          <w:rFonts w:ascii="Yu Gothic" w:hAnsi="Yu Gothic" w:eastAsia="Yu Gothic" w:cs="Yu Gothic"/>
+          <w:b w:val="0"/>
+          <w:color w:val="233544"/>
+          <w:sz w:val="22"/>
+        </w:rPr>
+        <w:t>取り込みは一方向のコピーで、元の個人用DBとの継続的な同期ではありません。管理者が取り込み先のメンバーを選び、試し読みの結果を確認してから実行します。詳しい対象と操作は</w:t>
+      </w:r>
+      <w:hyperlink r:id="rId18">
+        <w:r>
+          <w:rPr>
+            <w:color w:val="0B6666"/>
+            <w:sz w:val="22"/>
+            <w:u w:val="single"/>
+          </w:rPr>
+          <w:t>ガイド02</w:t>
+        </w:r>
+      </w:hyperlink>
+      <w:r>
+        <w:rPr>
+          <w:rFonts w:ascii="Yu Gothic" w:hAnsi="Yu Gothic" w:eastAsia="Yu Gothic" w:cs="Yu Gothic"/>
+          <w:b w:val="0"/>
+          <w:color w:val="233544"/>
+          <w:sz w:val="22"/>
+        </w:rPr>
+        <w:t>へ。</w:t>
+      </w:r>
+    </w:p>
+    <w:p>
+      <w:pPr>
+        <w:pStyle w:val="Heading2"/>
+      </w:pPr>
+      <w:r>
+        <w:rPr>
+          <w:rFonts w:ascii="Yu Gothic" w:hAnsi="Yu Gothic" w:eastAsia="Yu Gothic" w:cs="Yu Gothic"/>
+          <w:b/>
+          <w:color w:val="000000"/>
+          <w:sz w:val="25"/>
+        </w:rPr>
+        <w:t>メンバーは同じ接続先へ</w:t>
+      </w:r>
+    </w:p>
+    <w:p>
+      <w:r>
+        <w:rPr>
+          <w:rFonts w:ascii="Yu Gothic" w:hAnsi="Yu Gothic" w:eastAsia="Yu Gothic" w:cs="Yu Gothic"/>
+          <w:b w:val="0"/>
+          <w:color w:val="233544"/>
+          <w:sz w:val="22"/>
+        </w:rPr>
+        <w:t>管理者からURLとアカウントを受け取り、ブラウザでログインします。各メンバーのPCへのインストールは必須ではありません。デスクトップ版から同じチームへ接続することもでき、変更はリアルタイムで共有されます。</w:t>
+      </w:r>
+    </w:p>
+    <w:p>
+      <w:r>
+        <w:rPr>
+          <w:rFonts w:ascii="Yu Gothic" w:hAnsi="Yu Gothic" w:eastAsia="Yu Gothic" w:cs="Yu Gothic"/>
+          <w:b w:val="0"/>
+          <w:color w:val="233544"/>
+          <w:sz w:val="22"/>
+        </w:rPr>
+        <w:t>メンバーは確認や相談に、リーダーは分担と期限の見直しに使えます。件数や進捗率だけで判断せず、仕事に残った事情と一緒に見ます。共同作業の例は</w:t>
+      </w:r>
+      <w:hyperlink r:id="rId19">
+        <w:r>
+          <w:rPr>
+            <w:color w:val="0B6666"/>
+            <w:sz w:val="22"/>
+            <w:u w:val="single"/>
+          </w:rPr>
+          <w:t>ガイド03</w:t>
+        </w:r>
+      </w:hyperlink>
+      <w:r>
+        <w:rPr>
+          <w:rFonts w:ascii="Yu Gothic" w:hAnsi="Yu Gothic" w:eastAsia="Yu Gothic" w:cs="Yu Gothic"/>
+          <w:b w:val="0"/>
+          <w:color w:val="233544"/>
+          <w:sz w:val="22"/>
+        </w:rPr>
+        <w:t>にあります。</w:t>
       </w:r>
     </w:p>
     <w:p>
@@ -385,7 +623,7 @@
           <w:color w:val="000000"/>
           <w:sz w:val="40"/>
         </w:rPr>
-        <w:t>困ったことをその仕事の相談に</w:t>
+        <w:t>困ったことをその仕事で相談する</w:t>
       </w:r>
     </w:p>
     <w:p>
@@ -396,7 +634,7 @@
           <w:color w:val="233544"/>
           <w:sz w:val="22"/>
         </w:rPr>
-        <w:t>「試作はできたけれど、集計項目をどこまでそろえるか決めたい」。そんなときは、その仕事に進捗ログを残します。何ができて、何を相談したいのかを、仕事の状況と一緒に伝えられます。</w:t>
+        <w:t>「入力フォームの試作はできたけれど、集計項目をどこまでそろえるか決めたい」。そんなときは、その仕事に進捗ログを書き、判断や手助けが必要なら「要相談」を付けます。</w:t>
       </w:r>
     </w:p>
     <w:p>
@@ -409,7 +647,7 @@
         <w:drawing>
           <wp:inline xmlns:a="http://schemas.openxmlformats.org/drawingml/2006/main" xmlns:pic="http://schemas.openxmlformats.org/drawingml/2006/picture">
             <wp:extent cx="6264000" cy="2499466"/>
-            <wp:docPr id="4" name="Picture 4" descr="佐藤からの相談に高橋が返信した進捗ログ。仕事の名前、要相談、@名前、返信を一緒に確認できます。"/>
+            <wp:docPr id="5" name="Picture 5" descr="月次集計の相談と返信。見る所は「要相談」、佐藤の相談本文、高橋の返信。集計項目について判断待ちで、定例で確認することが分かります。"/>
             <wp:cNvGraphicFramePr>
               <a:graphicFrameLocks noChangeAspect="1"/>
             </wp:cNvGraphicFramePr>
@@ -421,7 +659,7 @@
                     <pic:cNvPicPr/>
                   </pic:nvPicPr>
                   <pic:blipFill>
-                    <a:blip r:embed="rId14"/>
+                    <a:blip r:embed="rId20"/>
                     <a:stretch>
                       <a:fillRect/>
                     </a:stretch>
@@ -451,7 +689,7 @@
           <w:color w:val="526271"/>
           <w:sz w:val="17"/>
         </w:rPr>
-        <w:t>佐藤からの相談に高橋が返信した進捗ログ。仕事の名前、要相談、@名前、返信を一緒に確認できます。</w:t>
+        <w:t>月次集計の相談と返信。見る所は「要相談」、佐藤の相談本文、高橋の返信。集計項目について判断待ちで、定例で確認することが分かります。</w:t>
       </w:r>
     </w:p>
     <w:p>
@@ -465,7 +703,7 @@
           <w:color w:val="000000"/>
           <w:sz w:val="25"/>
         </w:rPr>
-        <w:t>相談したいことを見つけてもらう</w:t>
+        <w:t>相手と相談したい内容を伝える</w:t>
       </w:r>
     </w:p>
     <w:p>
@@ -476,32 +714,7 @@
           <w:color w:val="233544"/>
           <w:sz w:val="22"/>
         </w:rPr>
-        <w:t>判断や手助けが必要な投稿には「要相談」の印を付けられます。「@高橋」のように名前を書くと相手に通知され、返信は元の投稿の下に残ります。別の話題に流れた後も、その仕事のやり取りを追えます。</w:t>
-      </w:r>
-    </w:p>
-    <w:p>
-      <w:pPr>
-        <w:pStyle w:val="Heading2"/>
-      </w:pPr>
-      <w:r>
-        <w:rPr>
-          <w:rFonts w:ascii="Yu Gothic" w:hAnsi="Yu Gothic" w:eastAsia="Yu Gothic" w:cs="Yu Gothic"/>
-          <w:b/>
-          <w:color w:val="000000"/>
-          <w:sz w:val="25"/>
-        </w:rPr>
-        <w:t>書くのは短くて大丈夫</w:t>
-      </w:r>
-    </w:p>
-    <w:p>
-      <w:r>
-        <w:rPr>
-          <w:rFonts w:ascii="Yu Gothic" w:hAnsi="Yu Gothic" w:eastAsia="Yu Gothic" w:cs="Yu Gothic"/>
-          <w:b w:val="0"/>
-          <w:color w:val="233544"/>
-          <w:sz w:val="22"/>
-        </w:rPr>
-        <w:t>そのタスクの詳細で「進捗ログを書く」を押すと、投稿欄が開きます。「やったこと」「次にやること」「困っていること」のひな形も使えます。毎回長く書く必要はありません。大きな変化がない日は「予定どおり」を押して一言を入力し、「投稿」で送れます。</w:t>
+        <w:t>「@高橋」のように名前を書くと相手に通知され、返信は元の投稿の下に残ります。相談を仕事の名前・担当・期限と一緒に追えるので、後から見返すときも内容を確かめられます。</w:t>
       </w:r>
     </w:p>
     <w:p>
@@ -514,7 +727,7 @@
         <w:drawing>
           <wp:inline xmlns:a="http://schemas.openxmlformats.org/drawingml/2006/main" xmlns:pic="http://schemas.openxmlformats.org/drawingml/2006/picture">
             <wp:extent cx="6264000" cy="501968"/>
-            <wp:docPr id="5" name="Picture 5" descr="タスク詳細の進捗率と「進捗ログを書く」。このボタンから投稿欄を開けます。"/>
+            <wp:docPr id="6" name="Picture 6" descr="タスク詳細の進捗率と「進捗ログを書く」。このボタンから投稿欄を開けます。"/>
             <wp:cNvGraphicFramePr>
               <a:graphicFrameLocks noChangeAspect="1"/>
             </wp:cNvGraphicFramePr>
@@ -526,7 +739,7 @@
                     <pic:cNvPicPr/>
                   </pic:nvPicPr>
                   <pic:blipFill>
-                    <a:blip r:embed="rId15"/>
+                    <a:blip r:embed="rId21"/>
                     <a:stretch>
                       <a:fillRect/>
                     </a:stretch>
@@ -560,6 +773,20 @@
       </w:r>
     </w:p>
     <w:p>
+      <w:pPr>
+        <w:pStyle w:val="Heading2"/>
+      </w:pPr>
+      <w:r>
+        <w:rPr>
+          <w:rFonts w:ascii="Yu Gothic" w:hAnsi="Yu Gothic" w:eastAsia="Yu Gothic" w:cs="Yu Gothic"/>
+          <w:b/>
+          <w:color w:val="000000"/>
+          <w:sz w:val="25"/>
+        </w:rPr>
+        <w:t>書くのは短くて大丈夫</w:t>
+      </w:r>
+    </w:p>
+    <w:p>
       <w:r>
         <w:rPr>
           <w:rFonts w:ascii="Yu Gothic" w:hAnsi="Yu Gothic" w:eastAsia="Yu Gothic" w:cs="Yu Gothic"/>
@@ -567,7 +794,37 @@
           <w:color w:val="233544"/>
           <w:sz w:val="22"/>
         </w:rPr>
-        <w:t>メンバーは状況と相談先を伝えられ、リーダーは何を判断すればよいかを確かめられます。進捗率だけでは分からない事情を共有する使い方です。</w:t>
+        <w:t>投稿欄では「やったこと」「次にやること」「困っていること」のひな形を使えます。大きな変化がない日は「予定どおり」を押し、一言を入れて「投稿」で送れます。</w:t>
+      </w:r>
+    </w:p>
+    <w:p>
+      <w:r>
+        <w:rPr>
+          <w:rFonts w:ascii="Yu Gothic" w:hAnsi="Yu Gothic" w:eastAsia="Yu Gothic" w:cs="Yu Gothic"/>
+          <w:b w:val="0"/>
+          <w:color w:val="233544"/>
+          <w:sz w:val="22"/>
+        </w:rPr>
+        <w:t>例では、佐藤さんが相談を書き、高橋さんが定例で確認すると返信しています。次は、この相談を見ながら対応を決めます。詳しい操作は</w:t>
+      </w:r>
+      <w:hyperlink r:id="rId19">
+        <w:r>
+          <w:rPr>
+            <w:color w:val="0B6666"/>
+            <w:sz w:val="22"/>
+            <w:u w:val="single"/>
+          </w:rPr>
+          <w:t>ガイド03の相談の例</w:t>
+        </w:r>
+      </w:hyperlink>
+      <w:r>
+        <w:rPr>
+          <w:rFonts w:ascii="Yu Gothic" w:hAnsi="Yu Gothic" w:eastAsia="Yu Gothic" w:cs="Yu Gothic"/>
+          <w:b w:val="0"/>
+          <w:color w:val="233544"/>
+          <w:sz w:val="22"/>
+        </w:rPr>
+        <w:t>へ。</w:t>
       </w:r>
     </w:p>
     <w:p>
@@ -586,7 +843,7 @@
           <w:color w:val="000000"/>
           <w:sz w:val="40"/>
         </w:rPr>
-        <w:t>定例で決まったことを次の仕事へ</w:t>
+        <w:t>定例の決定を次の仕事と報告へ</w:t>
       </w:r>
     </w:p>
     <w:p>
@@ -597,7 +854,7 @@
           <w:color w:val="233544"/>
           <w:sz w:val="22"/>
         </w:rPr>
-        <w:t>定例の前に別の一覧を作る代わりに、「報告」で期間を選びます。担当者ごとの仕事、進捗ログ、要相談の内容がまとまり、日々の記録を話し合いの材料にできます。</w:t>
+        <w:t>「報告」で期間を選ぶと、日々の進捗ログや要相談の内容を見直せます。「定例モード」では担当者ごとに確認しながら、次の対応を決められます。</w:t>
       </w:r>
     </w:p>
     <w:p>
@@ -610,7 +867,7 @@
         <w:drawing>
           <wp:inline xmlns:a="http://schemas.openxmlformats.org/drawingml/2006/main" xmlns:pic="http://schemas.openxmlformats.org/drawingml/2006/picture">
             <wp:extent cx="6264000" cy="2247968"/>
-            <wp:docPr id="6" name="Picture 6" descr="定例モードの担当名、追加したタスク、入力欄、メモを抜き出した例。佐藤さんのタスクに期限10月23日が保存されています。"/>
+            <wp:docPr id="7" name="Picture 7" descr="定例の同じ実画面から担当・保存済みタスク・追加欄・メモを抜き出した例。佐藤の仕事「部署別に残す項目を確認する」が、期限10月23日で登録されています。"/>
             <wp:cNvGraphicFramePr>
               <a:graphicFrameLocks noChangeAspect="1"/>
             </wp:cNvGraphicFramePr>
@@ -622,7 +879,7 @@
                     <pic:cNvPicPr/>
                   </pic:nvPicPr>
                   <pic:blipFill>
-                    <a:blip r:embed="rId16"/>
+                    <a:blip r:embed="rId22"/>
                     <a:stretch>
                       <a:fillRect/>
                     </a:stretch>
@@ -652,7 +909,7 @@
           <w:color w:val="526271"/>
           <w:sz w:val="17"/>
         </w:rPr>
-        <w:t>定例モードの担当名、追加したタスク、入力欄、メモを抜き出した例。佐藤さんのタスクに期限10月23日が保存されています。</w:t>
+        <w:t>定例の同じ実画面から担当・保存済みタスク・追加欄・メモを抜き出した例。佐藤の仕事「部署別に残す項目を確認する」が、期限10月23日で登録されています。</w:t>
       </w:r>
     </w:p>
     <w:p>
@@ -666,7 +923,7 @@
           <w:color w:val="000000"/>
           <w:sz w:val="25"/>
         </w:rPr>
-        <w:t>相談を見ながら次の対応を決める</w:t>
+        <w:t>決まったことを担当と期限のある仕事に</w:t>
       </w:r>
     </w:p>
     <w:p>
@@ -677,7 +934,7 @@
           <w:color w:val="233544"/>
           <w:sz w:val="22"/>
         </w:rPr>
-        <w:t>「定例モード」を開くと、担当者ごとに画面を切り替えながら確認できます。月次集計の例なら、部署ごとの集計項目の違いを見ながら「誰が、何を、いつまでに確認するか」を話し合えます。</w:t>
+        <w:t>月次集計の例では、定例で「共通項目をそろえる」と決めました。「決まったことをタスクにする」に仕事名と期限を入力し、「追加」で佐藤さんの仕事として残しています。会議の後も対応を追えます。</w:t>
       </w:r>
     </w:p>
     <w:p>
@@ -688,7 +945,7 @@
           <w:color w:val="233544"/>
           <w:sz w:val="22"/>
         </w:rPr>
-        <w:t>追加の対応は、画面右側の「決まったことをタスクにする」で名前と期限を入力し、「追加」を押すと登録できます。例では「共通項目をそろえる」と決め、佐藤さんの仕事として「部署別に残す項目を確認する」を期限10月23日で追加しました。決まったことが担当・期限のある仕事として残るので、次の確認につなげられます。</w:t>
+        <w:t>議事録は「議事録をコピー」で取り出して保存します。途中経過は使っている端末に12時間残りますが、長期保存の代わりにはならないので、終わったら議事録を保存します。</w:t>
       </w:r>
     </w:p>
     <w:p>
@@ -702,59 +959,7 @@
           <w:color w:val="000000"/>
           <w:sz w:val="25"/>
         </w:rPr>
-        <w:t>終わった後も対応を追える</w:t>
-      </w:r>
-    </w:p>
-    <w:p>
-      <w:r>
-        <w:rPr>
-          <w:rFonts w:ascii="Yu Gothic" w:hAnsi="Yu Gothic" w:eastAsia="Yu Gothic" w:cs="Yu Gothic"/>
-          <w:b w:val="0"/>
-          <w:color w:val="233544"/>
-          <w:sz w:val="22"/>
-        </w:rPr>
-        <w:t>議事録として残すときは、画面上部の「議事録をコピー」で取り出して保存します。定例メモ、追加したタスク、担当者ごとの時間がまとまります。</w:t>
-      </w:r>
-    </w:p>
-    <w:p>
-      <w:r>
-        <w:rPr>
-          <w:rFonts w:ascii="Yu Gothic" w:hAnsi="Yu Gothic" w:eastAsia="Yu Gothic" w:cs="Yu Gothic"/>
-          <w:b w:val="0"/>
-          <w:color w:val="233544"/>
-          <w:sz w:val="22"/>
-        </w:rPr>
-        <w:t>途中経過は使っている端末に12時間残るので、その間は画面を移動したり読み込み直したりしても再開できます。</w:t>
-      </w:r>
-    </w:p>
-    <w:p>
-      <w:r>
-        <w:br w:type="page"/>
-      </w:r>
-    </w:p>
-    <w:p>
-      <w:pPr>
-        <w:pStyle w:val="Heading1"/>
-      </w:pPr>
-      <w:r>
-        <w:rPr>
-          <w:rFonts w:ascii="Yu Gothic" w:hAnsi="Yu Gothic" w:eastAsia="Yu Gothic" w:cs="Yu Gothic"/>
-          <w:b/>
-          <w:color w:val="000000"/>
-          <w:sz w:val="40"/>
-        </w:rPr>
-        <w:t>週報は日々の記録から</w:t>
-      </w:r>
-    </w:p>
-    <w:p>
-      <w:r>
-        <w:rPr>
-          <w:rFonts w:ascii="Yu Gothic" w:hAnsi="Yu Gothic" w:eastAsia="Yu Gothic" w:cs="Yu Gothic"/>
-          <w:b w:val="0"/>
-          <w:color w:val="233544"/>
-          <w:sz w:val="22"/>
-        </w:rPr>
-        <w:t>週の終わりに「何を進めたか」を思い出すときも、報告タブを使えます。期間と担当を選ぶと、その間の進捗ログやメモ、期限の変更などをまとめて確認できます。</w:t>
+        <w:t>週報も日々の記録を材料に</w:t>
       </w:r>
     </w:p>
     <w:p>
@@ -767,7 +972,7 @@
         <w:drawing>
           <wp:inline xmlns:a="http://schemas.openxmlformats.org/drawingml/2006/main" xmlns:pic="http://schemas.openxmlformats.org/drawingml/2006/picture">
             <wp:extent cx="6264000" cy="1440161"/>
-            <wp:docPr id="7" name="Picture 7" descr="報告タブの上部。期間と担当を選び、「Markdownをコピー」で週報の材料を取り出せます。"/>
+            <wp:docPr id="8" name="Picture 8" descr="報告の期間・担当と出力ボタン。期間を選び「Markdownをコピー」で見出し付きの文章を取り出せます。CSVでも出力できます。"/>
             <wp:cNvGraphicFramePr>
               <a:graphicFrameLocks noChangeAspect="1"/>
             </wp:cNvGraphicFramePr>
@@ -779,7 +984,7 @@
                     <pic:cNvPicPr/>
                   </pic:nvPicPr>
                   <pic:blipFill>
-                    <a:blip r:embed="rId17"/>
+                    <a:blip r:embed="rId23"/>
                     <a:stretch>
                       <a:fillRect/>
                     </a:stretch>
@@ -809,21 +1014,7 @@
           <w:color w:val="526271"/>
           <w:sz w:val="17"/>
         </w:rPr>
-        <w:t>報告タブの上部。期間と担当を選び、「Markdownをコピー」で週報の材料を取り出せます。</w:t>
-      </w:r>
-    </w:p>
-    <w:p>
-      <w:pPr>
-        <w:pStyle w:val="Heading2"/>
-      </w:pPr>
-      <w:r>
-        <w:rPr>
-          <w:rFonts w:ascii="Yu Gothic" w:hAnsi="Yu Gothic" w:eastAsia="Yu Gothic" w:cs="Yu Gothic"/>
-          <w:b/>
-          <w:color w:val="000000"/>
-          <w:sz w:val="25"/>
-        </w:rPr>
-        <w:t>一から書き直す前に記録を取り出す</w:t>
+        <w:t>報告の期間・担当と出力ボタン。期間を選び「Markdownをコピー」で見出し付きの文章を取り出せます。CSVでも出力できます。</w:t>
       </w:r>
     </w:p>
     <w:p>
@@ -834,54 +1025,7 @@
           <w:color w:val="233544"/>
           <w:sz w:val="22"/>
         </w:rPr>
-        <w:t>報告画面の上部で期間と担当を選び、「Markdownをコピー」を押します。表示中の内容が見出し付きの文章になるので、普段の報告先に貼って、週報に使う部分を選べます。CSVでも取り出せます。</w:t>
-      </w:r>
-    </w:p>
-    <w:p>
-      <w:r>
-        <w:rPr>
-          <w:rFonts w:ascii="Yu Gothic" w:hAnsi="Yu Gothic" w:eastAsia="Yu Gothic" w:cs="Yu Gothic"/>
-          <w:b w:val="0"/>
-          <w:color w:val="233544"/>
-          <w:sz w:val="22"/>
-        </w:rPr>
-        <w:t>期間・担当の設定やコピーボタンが見当たらないときは、上部の「変える」を押すと表示されます。</w:t>
-      </w:r>
-    </w:p>
-    <w:p>
-      <w:r>
-        <w:rPr>
-          <w:rFonts w:ascii="Yu Gothic" w:hAnsi="Yu Gothic" w:eastAsia="Yu Gothic" w:cs="Yu Gothic"/>
-          <w:b w:val="0"/>
-          <w:color w:val="233544"/>
-          <w:sz w:val="22"/>
-        </w:rPr>
-        <w:t>月次集計の例なら、ログに残した試作の成果と集計項目の相談を確かめながら、週報にまとめられます。</w:t>
-      </w:r>
-    </w:p>
-    <w:p>
-      <w:pPr>
-        <w:pStyle w:val="Heading2"/>
-      </w:pPr>
-      <w:r>
-        <w:rPr>
-          <w:rFonts w:ascii="Yu Gothic" w:hAnsi="Yu Gothic" w:eastAsia="Yu Gothic" w:cs="Yu Gothic"/>
-          <w:b/>
-          <w:color w:val="000000"/>
-          <w:sz w:val="25"/>
-        </w:rPr>
-        <w:t>下書きは自分で確かめる</w:t>
-      </w:r>
-    </w:p>
-    <w:p>
-      <w:r>
-        <w:rPr>
-          <w:rFonts w:ascii="Yu Gothic" w:hAnsi="Yu Gothic" w:eastAsia="Yu Gothic" w:cs="Yu Gothic"/>
-          <w:b w:val="0"/>
-          <w:color w:val="233544"/>
-          <w:sz w:val="22"/>
-        </w:rPr>
-        <w:t>必要なら、コピーした文章を社内で使える文章作成ツールに渡して下書きに整えます。HAKOBIから自動で送信する操作ではありません。担当・期限・進捗・相談内容を確かめて、報告先に合う文章に仕上げます。</w:t>
+        <w:t>集計項目を相談した経過や期限の変更を確かめ、必要な部分を普段の報告先へ貼り付けます。上部の設定が見えなければ「変える」を押します。報告先に合う文章へ仕上げる前に、担当・期限・相談内容を自分で確認してください。</w:t>
       </w:r>
     </w:p>
     <w:p>
@@ -900,7 +1044,7 @@
           <w:color w:val="000000"/>
           <w:sz w:val="40"/>
         </w:rPr>
-        <w:t>まずはひとつの仕事をチームで</w:t>
+        <w:t>ひとつの仕事で使い続けられるか試す</w:t>
       </w:r>
     </w:p>
     <w:p>
@@ -911,7 +1055,7 @@
           <w:color w:val="233544"/>
           <w:sz w:val="22"/>
         </w:rPr>
-        <w:t>いま進めている仕事をひとつ選び、少人数で試してみてください。全業務を移す前に、状況が分かるか、相談に使えるかを確かめられます。</w:t>
+        <w:t>まずは身近な仕事を選び、個人用なら登録と記録を、チームなら相談と返信まで試してみてください。次の定例で、状況が分かったか、相談に使えたかを振り返ります。</w:t>
       </w:r>
     </w:p>
     <w:p>
@@ -925,7 +1069,7 @@
           <w:color w:val="000000"/>
           <w:sz w:val="25"/>
         </w:rPr>
-        <w:t>チームでまだ使っていない場合</w:t>
+        <w:t>自分に合う入口を選ぶ</w:t>
       </w:r>
     </w:p>
     <w:p>
@@ -936,7 +1080,26 @@
           <w:color w:val="233544"/>
           <w:sz w:val="22"/>
         </w:rPr>
-        <w:t>社内のPCやサーバーを管理する担当者に、この資料と試したい仕事・参加者を伝え、試用の準備を相談してください。紹介セット内の「導入を担当する方へ.md」には、アプリの入手方法とサーバーの準備手順があります。</w:t>
+        <w:t>ひとりで試す人：配布担当者からインストーラーを受け取ります。既存サーバーがあれば、そのURLの末尾に「/download」を付けた配布ページからも入手できます。</w:t>
+      </w:r>
+      <w:hyperlink r:id="rId15">
+        <w:r>
+          <w:rPr>
+            <w:color w:val="0B6666"/>
+            <w:sz w:val="22"/>
+            <w:u w:val="single"/>
+          </w:rPr>
+          <w:t>ガイド01</w:t>
+        </w:r>
+      </w:hyperlink>
+      <w:r>
+        <w:rPr>
+          <w:rFonts w:ascii="Yu Gothic" w:hAnsi="Yu Gothic" w:eastAsia="Yu Gothic" w:cs="Yu Gothic"/>
+          <w:b w:val="0"/>
+          <w:color w:val="233544"/>
+          <w:sz w:val="22"/>
+        </w:rPr>
+        <w:t>へ。</w:t>
       </w:r>
     </w:p>
     <w:p>
@@ -947,7 +1110,26 @@
           <w:color w:val="233544"/>
           <w:sz w:val="22"/>
         </w:rPr>
-        <w:t>チーム利用には、社内LANのサーバーと、管理者が発行するアカウントが必要です。ブラウザから使えるので、各メンバーのPCへのインストールは必須ではありません。</w:t>
+        <w:t>既存チームへ参加する人：管理者からURL・ユーザー名・初期パスワードを受け取り、ログインしてパスワードを変更します。</w:t>
+      </w:r>
+      <w:hyperlink r:id="rId19">
+        <w:r>
+          <w:rPr>
+            <w:color w:val="0B6666"/>
+            <w:sz w:val="22"/>
+            <w:u w:val="single"/>
+          </w:rPr>
+          <w:t>ガイド03</w:t>
+        </w:r>
+      </w:hyperlink>
+      <w:r>
+        <w:rPr>
+          <w:rFonts w:ascii="Yu Gothic" w:hAnsi="Yu Gothic" w:eastAsia="Yu Gothic" w:cs="Yu Gothic"/>
+          <w:b w:val="0"/>
+          <w:color w:val="233544"/>
+          <w:sz w:val="22"/>
+        </w:rPr>
+        <w:t>へ。</w:t>
       </w:r>
     </w:p>
     <w:p>
@@ -958,7 +1140,26 @@
           <w:color w:val="233544"/>
           <w:sz w:val="22"/>
         </w:rPr>
-        <w:t>すでに社内でHAKOBIを使っている場合は、管理者から接続先URLとアカウントを受け取り、次の手順で始められます。</w:t>
+        <w:t>新しく準備する人：入手先がなければ、管理担当者へこの資料と試したい仕事・参加者を渡します。準備担当者は</w:t>
+      </w:r>
+      <w:hyperlink r:id="rId24">
+        <w:r>
+          <w:rPr>
+            <w:color w:val="0B6666"/>
+            <w:sz w:val="22"/>
+            <w:u w:val="single"/>
+          </w:rPr>
+          <w:t>ガイド04</w:t>
+        </w:r>
+      </w:hyperlink>
+      <w:r>
+        <w:rPr>
+          <w:rFonts w:ascii="Yu Gothic" w:hAnsi="Yu Gothic" w:eastAsia="Yu Gothic" w:cs="Yu Gothic"/>
+          <w:b w:val="0"/>
+          <w:color w:val="233544"/>
+          <w:sz w:val="22"/>
+        </w:rPr>
+        <w:t>のビルド・配置手順へ。exeを受け取る利用者に開発環境は不要です。</w:t>
       </w:r>
     </w:p>
     <w:p>
@@ -972,7 +1173,7 @@
           <w:color w:val="000000"/>
           <w:sz w:val="25"/>
         </w:rPr>
-        <w:t>最初に試すこと</w:t>
+        <w:t>始める前に気になること</w:t>
       </w:r>
     </w:p>
     <w:p>
@@ -983,7 +1184,7 @@
           <w:color w:val="233544"/>
           <w:sz w:val="22"/>
         </w:rPr>
-        <w:t>1. 接続先をブラウザで開き、ログインする。</w:t>
+        <w:t>個人用での利用：個人用ならチームサーバーは不要です。チームへのデータ移行は管理者による取り込みが必要です。</w:t>
       </w:r>
     </w:p>
     <w:p>
@@ -994,7 +1195,7 @@
           <w:color w:val="233544"/>
           <w:sz w:val="22"/>
         </w:rPr>
-        <w:t>2. 「タスクを追加」で仕事の名前・担当・期限を登録する。</w:t>
+        <w:t>週報との二重入力：ログから材料を取り出せます。試用時に、既存報告のどの部分を置き換えるかを決めます。</w:t>
       </w:r>
     </w:p>
     <w:p>
@@ -1005,73 +1206,7 @@
           <w:color w:val="233544"/>
           <w:sz w:val="22"/>
         </w:rPr>
-        <w:t>3. 作業の区切りに進捗率を変え、「進捗ログを書く」から短い記録を投稿する。</w:t>
-      </w:r>
-    </w:p>
-    <w:p>
-      <w:r>
-        <w:rPr>
-          <w:rFonts w:ascii="Yu Gothic" w:hAnsi="Yu Gothic" w:eastAsia="Yu Gothic" w:cs="Yu Gothic"/>
-          <w:b w:val="0"/>
-          <w:color w:val="233544"/>
-          <w:sz w:val="22"/>
-        </w:rPr>
-        <w:t>4. 次の定例で「報告」を開き、相談したいことを一緒に確認する。決まった対応をタスクにし、議事録をコピーして保存する。</w:t>
-      </w:r>
-    </w:p>
-    <w:p>
-      <w:pPr>
-        <w:keepNext/>
-        <w:spacing w:line="240" w:lineRule="auto"/>
-        <w:jc w:val="center"/>
-      </w:pPr>
-      <w:r>
-        <w:drawing>
-          <wp:inline xmlns:a="http://schemas.openxmlformats.org/drawingml/2006/main" xmlns:pic="http://schemas.openxmlformats.org/drawingml/2006/picture">
-            <wp:extent cx="5040000" cy="2237455"/>
-            <wp:docPr id="8" name="Picture 8" descr="「タスクを追加」の名前・期限・担当の欄を抜き出した例。仕事の名前を入力し、期限と担当を選んで始められます。"/>
-            <wp:cNvGraphicFramePr>
-              <a:graphicFrameLocks noChangeAspect="1"/>
-            </wp:cNvGraphicFramePr>
-            <a:graphic>
-              <a:graphicData uri="http://schemas.openxmlformats.org/drawingml/2006/picture">
-                <pic:pic>
-                  <pic:nvPicPr>
-                    <pic:cNvPr id="0" name="quickadd-focus.png"/>
-                    <pic:cNvPicPr/>
-                  </pic:nvPicPr>
-                  <pic:blipFill>
-                    <a:blip r:embed="rId18"/>
-                    <a:stretch>
-                      <a:fillRect/>
-                    </a:stretch>
-                  </pic:blipFill>
-                  <pic:spPr>
-                    <a:xfrm>
-                      <a:off x="0" y="0"/>
-                      <a:ext cx="5040000" cy="2237455"/>
-                    </a:xfrm>
-                    <a:prstGeom prst="rect"/>
-                  </pic:spPr>
-                </pic:pic>
-              </a:graphicData>
-            </a:graphic>
-          </wp:inline>
-        </w:drawing>
-      </w:r>
-    </w:p>
-    <w:p>
-      <w:pPr>
-        <w:spacing w:after="160" w:line="240" w:lineRule="exact"/>
-      </w:pPr>
-      <w:r>
-        <w:rPr>
-          <w:rFonts w:ascii="Yu Gothic" w:hAnsi="Yu Gothic" w:eastAsia="Yu Gothic" w:cs="Yu Gothic"/>
-          <w:b w:val="0"/>
-          <w:color w:val="526271"/>
-          <w:sz w:val="17"/>
-        </w:rPr>
-        <w:t>「タスクを追加」の名前・期限・担当の欄を抜き出した例。仕事の名前を入力し、期限と担当を選んで始められます。</w:t>
+        <w:t>社内利用の確認：利用の可否は社内ルールと管理担当者へ確認してください。チーム用は社内LANでの利用を案内しています。</w:t>
       </w:r>
     </w:p>
     <w:p>
@@ -1085,7 +1220,7 @@
           <w:color w:val="000000"/>
           <w:sz w:val="25"/>
         </w:rPr>
-        <w:t>先にひとりで試す場合</w:t>
+        <w:t>試用の最後に確かめる</w:t>
       </w:r>
     </w:p>
     <w:p>
@@ -1096,7 +1231,7 @@
           <w:color w:val="233544"/>
           <w:sz w:val="22"/>
         </w:rPr>
-        <w:t>デスクトップ版の個人用モードなら、チーム用のサーバーは不要です。アプリの入手は導入を相談する担当者に確認してください。社内にHAKOBIのサーバーがある場合は、その接続先の「/download」ページからも入手できます。</w:t>
+        <w:t>個人用では、仕事と進捗ログを登録し、再起動後も残るか確認します。チームでは別の人が返信し、定例で決めた対応を担当・期限付きで残せたか確認します。</w:t>
       </w:r>
     </w:p>
     <w:p>
@@ -1107,7 +1242,26 @@
           <w:color w:val="233544"/>
           <w:sz w:val="22"/>
         </w:rPr>
-        <w:t>まずは「月次集計の見直し」のような身近な仕事で、明日の確認や相談に使ってみてください。次の定例で、状況が分かったか、相談に使えたかを振り返ってみましょう。</w:t>
+        <w:t>続ける場合は「いつログを書くか」「誰が相談を確認するか」「相談が済んだ印と議事録をどう残すか」を決めます。ガイドの</w:t>
+      </w:r>
+      <w:hyperlink r:id="rId25">
+        <w:r>
+          <w:rPr>
+            <w:color w:val="0B6666"/>
+            <w:sz w:val="22"/>
+            <w:u w:val="single"/>
+          </w:rPr>
+          <w:t>試用の確認リスト</w:t>
+        </w:r>
+      </w:hyperlink>
+      <w:r>
+        <w:rPr>
+          <w:rFonts w:ascii="Yu Gothic" w:hAnsi="Yu Gothic" w:eastAsia="Yu Gothic" w:cs="Yu Gothic"/>
+          <w:b w:val="0"/>
+          <w:color w:val="233544"/>
+          <w:sz w:val="22"/>
+        </w:rPr>
+        <w:t>も使えます。難しかった点を残し、いまの仕事に合う使い方を選んでください。</w:t>
       </w:r>
     </w:p>
     <w:sectPr>
@@ -1155,7 +1309,7 @@
         <w:color w:val="526271"/>
         <w:sz w:val="16"/>
       </w:rPr>
-      <w:t>HAKOBI  /  チームで進捗と相談を共有する</w:t>
+      <w:t>HAKOBI  /  ひとりで始めてチームで相談する</w:t>
     </w:r>
   </w:p>
 </w:hdr>

</xml_diff>